<commit_message>
fix: report TOC renders statically + appendix numbering; add PDF versions
- Replace docx auto-TOC field (rendered blank without a Word field-update)
  with a static contents list — dot leaders + verified page numbers
- Fix Appendix A list numbering (was continuing 6,7,8 from the pipeline
  list) via a separate numbering reference → now 1,2,3
- Add PDF exports of both deliverables for easy viewing
- Visually QA'd all 12 slides and all 9 report pages via LibreOffice render

Co-Authored-By: Claude Sonnet 4.6 <noreply@anthropic.com>
</commit_message>
<xml_diff>
--- a/deliverables/CINEMATCH-Report.docx
+++ b/deliverables/CINEMATCH-Report.docx
@@ -164,25 +164,356 @@
         <w:t xml:space="preserve">Table of Contents</w:t>
       </w:r>
     </w:p>
-    <w:sdt>
-      <w:sdtPr>
-        <w:alias w:val="Table of Contents"/>
-      </w:sdtPr>
-      <w:sdtContent>
-        <w:p>
-          <w:r>
-            <w:fldChar w:fldCharType="begin" w:dirty="true"/>
-            <w:instrText xml:space="preserve">TOC \h \o "1-2"</w:instrText>
-            <w:fldChar w:fldCharType="separate"/>
-          </w:r>
-        </w:p>
-        <w:p>
-          <w:r>
-            <w:fldChar w:fldCharType="end"/>
-          </w:r>
-        </w:p>
-      </w:sdtContent>
-    </w:sdt>
+    <w:p>
+      <w:r>
+        <w:t xml:space="preserve"/>
+      </w:r>
+    </w:p>
+    <w:p>
+      <w:pPr>
+        <w:tabs>
+          <w:tab w:val="right" w:pos="9360" w:leader="dot"/>
+        </w:tabs>
+        <w:spacing w:after="90" w:line="264"/>
+      </w:pPr>
+      <w:r>
+        <w:rPr>
+          <w:b/>
+          <w:bCs/>
+          <w:color w:val="1A1D27"/>
+        </w:rPr>
+        <w:t xml:space="preserve">1.  Executive Summary</w:t>
+      </w:r>
+      <w:r>
+        <w:rPr>
+          <w:b/>
+          <w:bCs/>
+        </w:rPr>
+        <w:t xml:space="preserve">	3</w:t>
+      </w:r>
+    </w:p>
+    <w:p>
+      <w:pPr>
+        <w:tabs>
+          <w:tab w:val="right" w:pos="9360" w:leader="dot"/>
+        </w:tabs>
+        <w:spacing w:after="90" w:line="264"/>
+      </w:pPr>
+      <w:r>
+        <w:rPr>
+          <w:b/>
+          <w:bCs/>
+          <w:color w:val="1A1D27"/>
+        </w:rPr>
+        <w:t xml:space="preserve">2.  Problem and Motivation</w:t>
+      </w:r>
+      <w:r>
+        <w:rPr>
+          <w:b/>
+          <w:bCs/>
+        </w:rPr>
+        <w:t xml:space="preserve">	3</w:t>
+      </w:r>
+    </w:p>
+    <w:p>
+      <w:pPr>
+        <w:tabs>
+          <w:tab w:val="right" w:pos="9360" w:leader="dot"/>
+        </w:tabs>
+        <w:spacing w:after="90" w:line="264"/>
+      </w:pPr>
+      <w:r>
+        <w:rPr>
+          <w:b/>
+          <w:bCs/>
+          <w:color w:val="1A1D27"/>
+        </w:rPr>
+        <w:t xml:space="preserve">3.  Project Goals and Scope</w:t>
+      </w:r>
+      <w:r>
+        <w:rPr>
+          <w:b/>
+          <w:bCs/>
+        </w:rPr>
+        <w:t xml:space="preserve">	3</w:t>
+      </w:r>
+    </w:p>
+    <w:p>
+      <w:pPr>
+        <w:tabs>
+          <w:tab w:val="right" w:pos="9360" w:leader="dot"/>
+        </w:tabs>
+        <w:spacing w:after="90" w:line="264"/>
+      </w:pPr>
+      <w:r>
+        <w:rPr>
+          <w:b/>
+          <w:bCs/>
+          <w:color w:val="1A1D27"/>
+        </w:rPr>
+        <w:t xml:space="preserve">4.  System Architecture</w:t>
+      </w:r>
+      <w:r>
+        <w:rPr>
+          <w:b/>
+          <w:bCs/>
+        </w:rPr>
+        <w:t xml:space="preserve">	4</w:t>
+      </w:r>
+    </w:p>
+    <w:p>
+      <w:pPr>
+        <w:tabs>
+          <w:tab w:val="right" w:pos="9360" w:leader="dot"/>
+        </w:tabs>
+        <w:spacing w:after="90" w:line="264"/>
+      </w:pPr>
+      <w:r>
+        <w:rPr>
+          <w:b/>
+          <w:bCs/>
+          <w:color w:val="1A1D27"/>
+        </w:rPr>
+        <w:t xml:space="preserve">5.  How AI / the LLM Is Used</w:t>
+      </w:r>
+      <w:r>
+        <w:rPr>
+          <w:b/>
+          <w:bCs/>
+        </w:rPr>
+        <w:t xml:space="preserve">	5</w:t>
+      </w:r>
+    </w:p>
+    <w:p>
+      <w:pPr>
+        <w:tabs>
+          <w:tab w:val="right" w:pos="9360" w:leader="dot"/>
+        </w:tabs>
+        <w:spacing w:after="90" w:line="264"/>
+      </w:pPr>
+      <w:r>
+        <w:rPr>
+          <w:b/>
+          <w:bCs/>
+          <w:color w:val="1A1D27"/>
+        </w:rPr>
+        <w:t xml:space="preserve">6.  The C Recommendation Engine</w:t>
+      </w:r>
+      <w:r>
+        <w:rPr>
+          <w:b/>
+          <w:bCs/>
+        </w:rPr>
+        <w:t xml:space="preserve">	5</w:t>
+      </w:r>
+    </w:p>
+    <w:p>
+      <w:pPr>
+        <w:tabs>
+          <w:tab w:val="right" w:pos="9360" w:leader="dot"/>
+        </w:tabs>
+        <w:spacing w:after="90" w:line="264"/>
+      </w:pPr>
+      <w:r>
+        <w:rPr>
+          <w:b/>
+          <w:bCs/>
+          <w:color w:val="1A1D27"/>
+        </w:rPr>
+        <w:t xml:space="preserve">7.  Application Features</w:t>
+      </w:r>
+      <w:r>
+        <w:rPr>
+          <w:b/>
+          <w:bCs/>
+        </w:rPr>
+        <w:t xml:space="preserve">	6</w:t>
+      </w:r>
+    </w:p>
+    <w:p>
+      <w:pPr>
+        <w:tabs>
+          <w:tab w:val="right" w:pos="9360" w:leader="dot"/>
+        </w:tabs>
+        <w:spacing w:after="90" w:line="264"/>
+      </w:pPr>
+      <w:r>
+        <w:rPr>
+          <w:b/>
+          <w:bCs/>
+          <w:color w:val="1A1D27"/>
+        </w:rPr>
+        <w:t xml:space="preserve">8.  Technology Stack and Data Sources</w:t>
+      </w:r>
+      <w:r>
+        <w:rPr>
+          <w:b/>
+          <w:bCs/>
+        </w:rPr>
+        <w:t xml:space="preserve">	6</w:t>
+      </w:r>
+    </w:p>
+    <w:p>
+      <w:pPr>
+        <w:tabs>
+          <w:tab w:val="right" w:pos="9360" w:leader="dot"/>
+        </w:tabs>
+        <w:spacing w:after="90" w:line="264"/>
+      </w:pPr>
+      <w:r>
+        <w:rPr>
+          <w:b/>
+          <w:bCs/>
+          <w:color w:val="1A1D27"/>
+        </w:rPr>
+        <w:t xml:space="preserve">9.  Reliability and Resilience</w:t>
+      </w:r>
+      <w:r>
+        <w:rPr>
+          <w:b/>
+          <w:bCs/>
+        </w:rPr>
+        <w:t xml:space="preserve">	7</w:t>
+      </w:r>
+    </w:p>
+    <w:p>
+      <w:pPr>
+        <w:tabs>
+          <w:tab w:val="right" w:pos="9360" w:leader="dot"/>
+        </w:tabs>
+        <w:spacing w:after="90" w:line="264"/>
+      </w:pPr>
+      <w:r>
+        <w:rPr>
+          <w:b/>
+          <w:bCs/>
+          <w:color w:val="1A1D27"/>
+        </w:rPr>
+        <w:t xml:space="preserve">10.  Engineering Process</w:t>
+      </w:r>
+      <w:r>
+        <w:rPr>
+          <w:b/>
+          <w:bCs/>
+        </w:rPr>
+        <w:t xml:space="preserve">	7</w:t>
+      </w:r>
+    </w:p>
+    <w:p>
+      <w:pPr>
+        <w:tabs>
+          <w:tab w:val="right" w:pos="9360" w:leader="dot"/>
+        </w:tabs>
+        <w:spacing w:after="90" w:line="264"/>
+      </w:pPr>
+      <w:r>
+        <w:rPr>
+          <w:b/>
+          <w:bCs/>
+          <w:color w:val="1A1D27"/>
+        </w:rPr>
+        <w:t xml:space="preserve">11.  Challenges and Solutions</w:t>
+      </w:r>
+      <w:r>
+        <w:rPr>
+          <w:b/>
+          <w:bCs/>
+        </w:rPr>
+        <w:t xml:space="preserve">	7</w:t>
+      </w:r>
+    </w:p>
+    <w:p>
+      <w:pPr>
+        <w:tabs>
+          <w:tab w:val="right" w:pos="9360" w:leader="dot"/>
+        </w:tabs>
+        <w:spacing w:after="90" w:line="264"/>
+      </w:pPr>
+      <w:r>
+        <w:rPr>
+          <w:b/>
+          <w:bCs/>
+          <w:color w:val="1A1D27"/>
+        </w:rPr>
+        <w:t xml:space="preserve">12.  Results</w:t>
+      </w:r>
+      <w:r>
+        <w:rPr>
+          <w:b/>
+          <w:bCs/>
+        </w:rPr>
+        <w:t xml:space="preserve">	8</w:t>
+      </w:r>
+    </w:p>
+    <w:p>
+      <w:pPr>
+        <w:tabs>
+          <w:tab w:val="right" w:pos="9360" w:leader="dot"/>
+        </w:tabs>
+        <w:spacing w:after="90" w:line="264"/>
+      </w:pPr>
+      <w:r>
+        <w:rPr>
+          <w:b/>
+          <w:bCs/>
+          <w:color w:val="1A1D27"/>
+        </w:rPr>
+        <w:t xml:space="preserve">13.  Future Work</w:t>
+      </w:r>
+      <w:r>
+        <w:rPr>
+          <w:b/>
+          <w:bCs/>
+        </w:rPr>
+        <w:t xml:space="preserve">	8</w:t>
+      </w:r>
+    </w:p>
+    <w:p>
+      <w:pPr>
+        <w:tabs>
+          <w:tab w:val="right" w:pos="9360" w:leader="dot"/>
+        </w:tabs>
+        <w:spacing w:after="90" w:line="264"/>
+      </w:pPr>
+      <w:r>
+        <w:rPr>
+          <w:b/>
+          <w:bCs/>
+          <w:color w:val="1A1D27"/>
+        </w:rPr>
+        <w:t xml:space="preserve">14.  Conclusion</w:t>
+      </w:r>
+      <w:r>
+        <w:rPr>
+          <w:b/>
+          <w:bCs/>
+        </w:rPr>
+        <w:t xml:space="preserve">	8</w:t>
+      </w:r>
+    </w:p>
+    <w:p>
+      <w:pPr>
+        <w:tabs>
+          <w:tab w:val="right" w:pos="9360" w:leader="dot"/>
+        </w:tabs>
+        <w:spacing w:after="90" w:line="264"/>
+      </w:pPr>
+      <w:r>
+        <w:rPr>
+          <w:b/>
+          <w:bCs/>
+          <w:color w:val="1A1D27"/>
+        </w:rPr>
+        <w:t xml:space="preserve">Appendix A — How to Run</w:t>
+      </w:r>
+      <w:r>
+        <w:rPr>
+          <w:b/>
+          <w:bCs/>
+        </w:rPr>
+        <w:t xml:space="preserve">	9</w:t>
+      </w:r>
+    </w:p>
     <w:p>
       <w:r>
         <w:br w:type="page"/>
@@ -3228,7 +3559,7 @@
         <w:pStyle w:val="ListParagraph"/>
         <w:numPr>
           <w:ilvl w:val="0"/>
-          <w:numId w:val="3"/>
+          <w:numId w:val="4"/>
         </w:numPr>
         <w:spacing w:after="70" w:line="264"/>
       </w:pPr>
@@ -3241,7 +3572,7 @@
         <w:pStyle w:val="ListParagraph"/>
         <w:numPr>
           <w:ilvl w:val="0"/>
-          <w:numId w:val="3"/>
+          <w:numId w:val="4"/>
         </w:numPr>
         <w:spacing w:after="70" w:line="264"/>
       </w:pPr>
@@ -3254,7 +3585,7 @@
         <w:pStyle w:val="ListParagraph"/>
         <w:numPr>
           <w:ilvl w:val="0"/>
-          <w:numId w:val="3"/>
+          <w:numId w:val="4"/>
         </w:numPr>
         <w:spacing w:after="70" w:line="264"/>
       </w:pPr>
@@ -3271,7 +3602,7 @@
       <w:r>
         <w:t xml:space="preserve">Source code: </w:t>
       </w:r>
-      <w:hyperlink w:history="1" r:id="rIdrpxuckmd6vuvz8bjewge2">
+      <w:hyperlink w:history="1" r:id="rId3xorp4fhtgp9_ddtjwc9j">
         <w:r>
           <w:rPr>
             <w:rStyle w:val="Hyperlink"/>
@@ -3508,6 +3839,18 @@
       </w:pPr>
     </w:lvl>
   </w:abstractNum>
+  <w:abstractNum w:abstractNumId="4" w15:restartNumberingAfterBreak="0">
+    <w:multiLevelType w:val="hybridMultilevel"/>
+    <w:lvl w:ilvl="0" w15:tentative="1">
+      <w:start w:val="1"/>
+      <w:numFmt w:val="decimal"/>
+      <w:lvlText w:val="%1."/>
+      <w:lvlJc w:val="left"/>
+      <w:pPr>
+        <w:ind w:left="520" w:hanging="260"/>
+      </w:pPr>
+    </w:lvl>
+  </w:abstractNum>
   <w:num w:numId="1">
     <w:abstractNumId w:val="1"/>
     <w:lvlOverride w:ilvl="0">
@@ -3522,6 +3865,12 @@
   </w:num>
   <w:num w:numId="3">
     <w:abstractNumId w:val="3"/>
+    <w:lvlOverride w:ilvl="0">
+      <w:startOverride w:val="1"/>
+    </w:lvlOverride>
+  </w:num>
+  <w:num w:numId="4">
+    <w:abstractNumId w:val="4"/>
     <w:lvlOverride w:ilvl="0">
       <w:startOverride w:val="1"/>
     </w:lvlOverride>

</xml_diff>